<commit_message>
docs: correct the GitHub connector note in the tech stack
The previous wording claimed no GitHub connector exists. That is wrong:
the owner has GitHub Integration connected at the account level, and it
works on claude.ai.

What is actually true is narrower — the connector is not exposed to Claude
Code desktop sessions and cannot be enabled from one, so every GitHub
operation in this project goes through the gh CLI. That is a surface
limitation, not an absent connector, and it matters if this repository is
ever worked on from claude.ai in a browser instead.

The original claim came from two tools that answer different questions
than the one asked: the registry search lists connectors available to add,
and the session status lists connectors this surface can toggle. Neither
surfaces an account-level connector that this surface does not support.

Co-Authored-By: Claude Opus 5 <noreply@anthropic.com>
</commit_message>
<xml_diff>
--- a/docs/tech stack.docx
+++ b/docs/tech stack.docx
@@ -937,10 +937,19 @@
         <w:rPr>
           <w:b/>
         </w:rPr>
-        <w:t>Evaluated and not available:</w:t>
+        <w:t>GitHub Integration connector - installed on the account, not usable from here.</w:t>
       </w:r>
       <w:r>
-        <w:t xml:space="preserve"> there is no GitHub MCP connector in the registry, and no matching skill in the account. The </w:t>
+        <w:t xml:space="preserve"> The owner has it connected on claude.ai, where it works normally. It is </w:t>
+      </w:r>
+      <w:r>
+        <w:rPr>
+          <w:b/>
+        </w:rPr>
+        <w:t>not exposed to Claude Code desktop sessions</w:t>
+      </w:r>
+      <w:r>
+        <w:t xml:space="preserve"> and cannot be enabled from one, so every GitHub operation in this project goes through the </w:t>
       </w:r>
       <w:r>
         <w:rPr>
@@ -951,7 +960,34 @@
         <w:t>gh</w:t>
       </w:r>
       <w:r>
-        <w:t xml:space="preserve"> CLI covers the need.</w:t>
+        <w:t xml:space="preserve"> CLI instead. This is a surface limitation, not a missing connector - worth knowing if you ever work on this repository from claude.ai in a browser rather than from the desktop app.</w:t>
+      </w:r>
+    </w:p>
+    <w:p>
+      <w:r>
+        <w:t xml:space="preserve">No matching skill exists in the account either. The </w:t>
+      </w:r>
+      <w:r>
+        <w:rPr>
+          <w:rFonts w:ascii="Consolas" w:hAnsi="Consolas"/>
+          <w:color w:val="A03030"/>
+          <w:sz w:val="19"/>
+        </w:rPr>
+        <w:t>gh</w:t>
+      </w:r>
+      <w:r>
+        <w:t xml:space="preserve"> CLI covers the need: </w:t>
+      </w:r>
+      <w:r>
+        <w:rPr>
+          <w:rFonts w:ascii="Consolas" w:hAnsi="Consolas"/>
+          <w:color w:val="A03030"/>
+          <w:sz w:val="19"/>
+        </w:rPr>
+        <w:t>gh api</w:t>
+      </w:r>
+      <w:r>
+        <w:t xml:space="preserve"> reaches the full GitHub REST and GraphQL API, so nothing a connector would provide is out of reach.</w:t>
       </w:r>
     </w:p>
     <w:p>

</xml_diff>